<commit_message>
sync: devin/1793164552-em-final-qc merged (subdir: agentic-conservation)
Co-Authored-By: Tatsuki Onishi <bougtoir@gmail.com>
</commit_message>
<xml_diff>
--- a/manuscript/EM_MANUSCRIPT.docx
+++ b/manuscript/EM_MANUSCRIPT.docx
@@ -55,7 +55,7 @@
         <w:t xml:space="preserve">- </w:t>
       </w:r>
       <w:r>
-        <w:t>A fully specified individual-based model couples wild habitat, managed facilities, and a non-living biobank.</w:t>
+        <w:t>Individual-based model couples wild habitat, managed care, and a biobank.</w:t>
       </w:r>
     </w:p>
     <w:p>
@@ -69,7 +69,7 @@
         <w:t xml:space="preserve">- </w:t>
       </w:r>
       <w:r>
-        <w:t>Fixed, interpretable decision rules are compared, not optimized policies; no POMDP or MCMC machinery is used.</w:t>
+        <w:t>Fixed decision rules compared; no POMDP or MCMC machinery.</w:t>
       </w:r>
     </w:p>
     <w:p>
@@ -83,7 +83,7 @@
         <w:t xml:space="preserve">- </w:t>
       </w:r>
       <w:r>
-        <w:t>Habitat-first and circulation policies reverse across two-factor environmental sweeps with no universal winner.</w:t>
+        <w:t>Habitat-first versus circulation ranking reverses across environmental sweeps.</w:t>
       </w:r>
     </w:p>
     <w:p>
@@ -97,7 +97,7 @@
         <w:t xml:space="preserve">- </w:t>
       </w:r>
       <w:r>
-        <w:t>Species lost before becoming visible to managers ('extinction before discovery') persist under most policies.</w:t>
+        <w:t>Latent species go extinct before discovery under most policies.</w:t>
       </w:r>
     </w:p>
     <w:p>
@@ -111,7 +111,7 @@
         <w:t xml:space="preserve">- </w:t>
       </w:r>
       <w:r>
-        <w:t>Perfect current-state information does not improve outcomes, because the binding constraint is action capacity, not observation.</w:t>
+        <w:t>Perfect current-state information does not improve outcomes.</w:t>
       </w:r>
     </w:p>
     <w:p>
@@ -125,12 +125,12 @@
     </w:p>
     <w:p>
       <w:r>
-        <w:t>Conservation planning increasingly coordinates wild habitat protection, zoos, breeding centres, pre-release stations, rehabilitation, and biobanking into a single managed network, yet the conditions under which active circulation between wild and managed nodes outperforms simpler strategies are poorly understood. We built an individual-based Monte Carlo simulation of eight synthetic species across nine node types over 100 annual time steps, with noisy and delayed observation, discovery of initially latent species, environmental change, disease, inbreeding, welfare costs, and budget feedback from public engagement. Eight fixed, fully specified decision rules (S0–S8) were compared under 192 paired-seed replicates, Latin-hypercube sensitivity analysis, five two-factor environmental sweeps, feature ablations, and a perfect-current-state-information comparator. A habitat-first policy (S6) achieved mean year-100 species survival of 0.529 [0.000, 0.875] versus 0.473 [0.125, 0.750] for the balanced circulation policy (S7); robust sweep cells favoured S7 in 35 cells and S6 in 26 cells, with 64 indeterminate. Six of eight policies were non-dominated across six objectives, so no weighting collapses the trade-off to a single best policy. The paired perfect-information effect on the prespecified utility index was -0.003 [-0.112, 0.131], indistinguishable from zero. The main transferable result is mechanistic rather than prescriptive: circulation between wild and managed nodes pays when habitat deteriorates faster than movement and welfare costs accumulate, and it fails otherwise; the threshold is located inside the model's own parameter space, not assumed. A reduced two-channel criterion derived from the same equations predicts the direction of strong reversals in held-out configurations but cannot detect marginal, statistically indeterminate ones. Extinction before discovery remains the dominant failure mode across all feasible policies.</w:t>
+        <w:t>Conservation planning increasingly coordinates wild habitat protection, zoos, breeding centres, pre-release stations, rehabilitation, and biobanking into a single managed network, yet the conditions under which active circulation between wild and managed nodes outperforms simpler strategies are poorly understood. We built an individual-based Monte Carlo simulation of eight synthetic species across nine node types over 100 annual time steps, with noisy and delayed observation, discovery of initially latent species, environmental change, disease, inbreeding, welfare costs, and budget feedback from public engagement. Eight fixed, fully specified decision rules (S0–S8) were compared under 192 paired-seed replicates, Latin-hypercube sensitivity analysis, five two-factor environmental sweeps, feature ablations, and a perfect-current-state-information comparator. A habitat-first policy (S6) achieved mean year-100 species survival of 0.529 [0.000, 0.875] versus 0.473 [0.125, 0.750] for the balanced circulation policy (S7); robust sweep cells favoured S7 in 35 cells and S6 in 26 cells, with 64 indeterminate. Six of eight policies were non-dominated across six objectives. The paired perfect-information effect on the prespecified utility index was -0.003 [-0.112, 0.131], indistinguishable from zero. The main transferable result is mechanistic rather than prescriptive: circulation between wild and managed nodes pays when habitat deteriorates faster than movement and welfare costs accumulate, and it fails otherwise; the threshold is located inside the model's own parameter space, not assumed. A reduced two-channel criterion derived from the same equations predicts the direction of strong reversals in held-out configurations but cannot detect marginal, statistically indeterminate ones. Extinction before discovery remains the dominant failure mode across all feasible policies.</w:t>
       </w:r>
     </w:p>
     <w:p>
       <w:r>
-        <w:t>Keywords: individual-based model; ex situ conservation; reintroduction; decision analysis; stochastic simulation; latent biodiversity; Monte Carlo</w:t>
+        <w:t>Keywords: individual-based model; ex situ conservation; reintroduction; decision analysis; stochastic simulation; latent biodiversity</w:t>
       </w:r>
     </w:p>
     <w:p>

</xml_diff>